<commit_message>
square payment links added
</commit_message>
<xml_diff>
--- a/Downloads/HollisAI2/DogBakery/HappyDog_Meeting_Prep.docx
+++ b/Downloads/HollisAI2/DogBakery/HappyDog_Meeting_Prep.docx
@@ -72,12 +72,6 @@
         <w:gridCol w:w="7160"/>
       </w:tblGrid>
       <w:tr>
-        <w:tblPrEx>
-          <w:tblCellMar>
-            <w:top w:w="0" w:type="dxa"/>
-            <w:bottom w:w="0" w:type="dxa"/>
-          </w:tblCellMar>
-        </w:tblPrEx>
         <w:tc>
           <w:tcPr>
             <w:tcW w:w="2200" w:type="dxa"/>
@@ -152,12 +146,6 @@
         </w:tc>
       </w:tr>
       <w:tr>
-        <w:tblPrEx>
-          <w:tblCellMar>
-            <w:top w:w="0" w:type="dxa"/>
-            <w:bottom w:w="0" w:type="dxa"/>
-          </w:tblCellMar>
-        </w:tblPrEx>
         <w:tc>
           <w:tcPr>
             <w:tcW w:w="2200" w:type="dxa"/>
@@ -216,12 +204,6 @@
         </w:tc>
       </w:tr>
       <w:tr>
-        <w:tblPrEx>
-          <w:tblCellMar>
-            <w:top w:w="0" w:type="dxa"/>
-            <w:bottom w:w="0" w:type="dxa"/>
-          </w:tblCellMar>
-        </w:tblPrEx>
         <w:tc>
           <w:tcPr>
             <w:tcW w:w="2200" w:type="dxa"/>
@@ -280,12 +262,6 @@
         </w:tc>
       </w:tr>
       <w:tr>
-        <w:tblPrEx>
-          <w:tblCellMar>
-            <w:top w:w="0" w:type="dxa"/>
-            <w:bottom w:w="0" w:type="dxa"/>
-          </w:tblCellMar>
-        </w:tblPrEx>
         <w:tc>
           <w:tcPr>
             <w:tcW w:w="2200" w:type="dxa"/>
@@ -344,12 +320,6 @@
         </w:tc>
       </w:tr>
       <w:tr>
-        <w:tblPrEx>
-          <w:tblCellMar>
-            <w:top w:w="0" w:type="dxa"/>
-            <w:bottom w:w="0" w:type="dxa"/>
-          </w:tblCellMar>
-        </w:tblPrEx>
         <w:tc>
           <w:tcPr>
             <w:tcW w:w="2200" w:type="dxa"/>
@@ -408,12 +378,6 @@
         </w:tc>
       </w:tr>
       <w:tr>
-        <w:tblPrEx>
-          <w:tblCellMar>
-            <w:top w:w="0" w:type="dxa"/>
-            <w:bottom w:w="0" w:type="dxa"/>
-          </w:tblCellMar>
-        </w:tblPrEx>
         <w:tc>
           <w:tcPr>
             <w:tcW w:w="2200" w:type="dxa"/>
@@ -472,12 +436,6 @@
         </w:tc>
       </w:tr>
       <w:tr>
-        <w:tblPrEx>
-          <w:tblCellMar>
-            <w:top w:w="0" w:type="dxa"/>
-            <w:bottom w:w="0" w:type="dxa"/>
-          </w:tblCellMar>
-        </w:tblPrEx>
         <w:tc>
           <w:tcPr>
             <w:tcW w:w="2200" w:type="dxa"/>
@@ -536,12 +494,6 @@
         </w:tc>
       </w:tr>
       <w:tr>
-        <w:tblPrEx>
-          <w:tblCellMar>
-            <w:top w:w="0" w:type="dxa"/>
-            <w:bottom w:w="0" w:type="dxa"/>
-          </w:tblCellMar>
-        </w:tblPrEx>
         <w:tc>
           <w:tcPr>
             <w:tcW w:w="2200" w:type="dxa"/>
@@ -658,12 +610,6 @@
         <w:gridCol w:w="9360"/>
       </w:tblGrid>
       <w:tr>
-        <w:tblPrEx>
-          <w:tblCellMar>
-            <w:top w:w="0" w:type="dxa"/>
-            <w:bottom w:w="0" w:type="dxa"/>
-          </w:tblCellMar>
-        </w:tblPrEx>
         <w:tc>
           <w:tcPr>
             <w:tcW w:w="9360" w:type="dxa"/>
@@ -727,12 +673,6 @@
         <w:gridCol w:w="9360"/>
       </w:tblGrid>
       <w:tr>
-        <w:tblPrEx>
-          <w:tblCellMar>
-            <w:top w:w="0" w:type="dxa"/>
-            <w:bottom w:w="0" w:type="dxa"/>
-          </w:tblCellMar>
-        </w:tblPrEx>
         <w:tc>
           <w:tcPr>
             <w:tcW w:w="9360" w:type="dxa"/>
@@ -777,12 +717,6 @@
         </w:tc>
       </w:tr>
       <w:tr>
-        <w:tblPrEx>
-          <w:tblCellMar>
-            <w:top w:w="0" w:type="dxa"/>
-            <w:bottom w:w="0" w:type="dxa"/>
-          </w:tblCellMar>
-        </w:tblPrEx>
         <w:tc>
           <w:tcPr>
             <w:tcW w:w="9360" w:type="dxa"/>
@@ -804,12 +738,6 @@
         </w:tc>
       </w:tr>
       <w:tr>
-        <w:tblPrEx>
-          <w:tblCellMar>
-            <w:top w:w="0" w:type="dxa"/>
-            <w:bottom w:w="0" w:type="dxa"/>
-          </w:tblCellMar>
-        </w:tblPrEx>
         <w:tc>
           <w:tcPr>
             <w:tcW w:w="9360" w:type="dxa"/>
@@ -852,12 +780,6 @@
         </w:tc>
       </w:tr>
       <w:tr>
-        <w:tblPrEx>
-          <w:tblCellMar>
-            <w:top w:w="0" w:type="dxa"/>
-            <w:bottom w:w="0" w:type="dxa"/>
-          </w:tblCellMar>
-        </w:tblPrEx>
         <w:tc>
           <w:tcPr>
             <w:tcW w:w="9360" w:type="dxa"/>
@@ -879,12 +801,6 @@
         </w:tc>
       </w:tr>
       <w:tr>
-        <w:tblPrEx>
-          <w:tblCellMar>
-            <w:top w:w="0" w:type="dxa"/>
-            <w:bottom w:w="0" w:type="dxa"/>
-          </w:tblCellMar>
-        </w:tblPrEx>
         <w:tc>
           <w:tcPr>
             <w:tcW w:w="9360" w:type="dxa"/>
@@ -906,12 +822,6 @@
         </w:tc>
       </w:tr>
       <w:tr>
-        <w:tblPrEx>
-          <w:tblCellMar>
-            <w:top w:w="0" w:type="dxa"/>
-            <w:bottom w:w="0" w:type="dxa"/>
-          </w:tblCellMar>
-        </w:tblPrEx>
         <w:tc>
           <w:tcPr>
             <w:tcW w:w="9360" w:type="dxa"/>
@@ -933,12 +843,6 @@
         </w:tc>
       </w:tr>
       <w:tr>
-        <w:tblPrEx>
-          <w:tblCellMar>
-            <w:top w:w="0" w:type="dxa"/>
-            <w:bottom w:w="0" w:type="dxa"/>
-          </w:tblCellMar>
-        </w:tblPrEx>
         <w:tc>
           <w:tcPr>
             <w:tcW w:w="9360" w:type="dxa"/>
@@ -960,12 +864,6 @@
         </w:tc>
       </w:tr>
       <w:tr>
-        <w:tblPrEx>
-          <w:tblCellMar>
-            <w:top w:w="0" w:type="dxa"/>
-            <w:bottom w:w="0" w:type="dxa"/>
-          </w:tblCellMar>
-        </w:tblPrEx>
         <w:tc>
           <w:tcPr>
             <w:tcW w:w="9360" w:type="dxa"/>
@@ -1029,12 +927,6 @@
         <w:gridCol w:w="9360"/>
       </w:tblGrid>
       <w:tr>
-        <w:tblPrEx>
-          <w:tblCellMar>
-            <w:top w:w="0" w:type="dxa"/>
-            <w:bottom w:w="0" w:type="dxa"/>
-          </w:tblCellMar>
-        </w:tblPrEx>
         <w:tc>
           <w:tcPr>
             <w:tcW w:w="9360" w:type="dxa"/>
@@ -1056,12 +948,6 @@
         </w:tc>
       </w:tr>
       <w:tr>
-        <w:tblPrEx>
-          <w:tblCellMar>
-            <w:top w:w="0" w:type="dxa"/>
-            <w:bottom w:w="0" w:type="dxa"/>
-          </w:tblCellMar>
-        </w:tblPrEx>
         <w:tc>
           <w:tcPr>
             <w:tcW w:w="9360" w:type="dxa"/>
@@ -1083,12 +969,6 @@
         </w:tc>
       </w:tr>
       <w:tr>
-        <w:tblPrEx>
-          <w:tblCellMar>
-            <w:top w:w="0" w:type="dxa"/>
-            <w:bottom w:w="0" w:type="dxa"/>
-          </w:tblCellMar>
-        </w:tblPrEx>
         <w:tc>
           <w:tcPr>
             <w:tcW w:w="9360" w:type="dxa"/>
@@ -1152,12 +1032,6 @@
         <w:gridCol w:w="9360"/>
       </w:tblGrid>
       <w:tr>
-        <w:tblPrEx>
-          <w:tblCellMar>
-            <w:top w:w="0" w:type="dxa"/>
-            <w:bottom w:w="0" w:type="dxa"/>
-          </w:tblCellMar>
-        </w:tblPrEx>
         <w:tc>
           <w:tcPr>
             <w:tcW w:w="9360" w:type="dxa"/>
@@ -1179,12 +1053,6 @@
         </w:tc>
       </w:tr>
       <w:tr>
-        <w:tblPrEx>
-          <w:tblCellMar>
-            <w:top w:w="0" w:type="dxa"/>
-            <w:bottom w:w="0" w:type="dxa"/>
-          </w:tblCellMar>
-        </w:tblPrEx>
         <w:tc>
           <w:tcPr>
             <w:tcW w:w="9360" w:type="dxa"/>
@@ -1248,12 +1116,6 @@
         <w:gridCol w:w="9360"/>
       </w:tblGrid>
       <w:tr>
-        <w:tblPrEx>
-          <w:tblCellMar>
-            <w:top w:w="0" w:type="dxa"/>
-            <w:bottom w:w="0" w:type="dxa"/>
-          </w:tblCellMar>
-        </w:tblPrEx>
         <w:tc>
           <w:tcPr>
             <w:tcW w:w="9360" w:type="dxa"/>
@@ -1317,12 +1179,6 @@
         <w:gridCol w:w="9360"/>
       </w:tblGrid>
       <w:tr>
-        <w:tblPrEx>
-          <w:tblCellMar>
-            <w:top w:w="0" w:type="dxa"/>
-            <w:bottom w:w="0" w:type="dxa"/>
-          </w:tblCellMar>
-        </w:tblPrEx>
         <w:tc>
           <w:tcPr>
             <w:tcW w:w="9360" w:type="dxa"/>
@@ -1352,34 +1208,42 @@
         <w:rPr>
           <w:b/>
           <w:bCs/>
-          <w:sz w:val="44"/>
-          <w:szCs w:val="44"/>
+          <w:sz w:val="32"/>
+          <w:szCs w:val="32"/>
         </w:rPr>
         <w:t xml:space="preserve">Don’t necessarily use these </w:t>
       </w:r>
-      <w:proofErr w:type="gramStart"/>
       <w:r>
         <w:rPr>
           <w:b/>
           <w:bCs/>
-          <w:sz w:val="44"/>
-          <w:szCs w:val="44"/>
+          <w:sz w:val="32"/>
+          <w:szCs w:val="32"/>
         </w:rPr>
-        <w:t>in</w:t>
-      </w:r>
-      <w:proofErr w:type="gramEnd"/>
+        <w:t>on</w:t>
+      </w:r>
       <w:r>
         <w:rPr>
           <w:b/>
           <w:bCs/>
-          <w:sz w:val="44"/>
-          <w:szCs w:val="44"/>
+          <w:sz w:val="32"/>
+          <w:szCs w:val="32"/>
         </w:rPr>
         <w:t xml:space="preserve"> the website yet</w:t>
       </w:r>
       <w:r>
         <w:t xml:space="preserve">: </w:t>
       </w:r>
+    </w:p>
+    <w:p>
+      <w:pPr>
+        <w:spacing w:before="80"/>
+      </w:pPr>
+    </w:p>
+    <w:p>
+      <w:pPr>
+        <w:spacing w:before="80"/>
+      </w:pPr>
       <w:r>
         <w:t xml:space="preserve">More ideas- this is a hard business it needs to be approached as all niche companies are similar to like </w:t>
       </w:r>
@@ -1389,7 +1253,241 @@
       </w:r>
       <w:proofErr w:type="spellEnd"/>
       <w:r>
-        <w:t xml:space="preserve"> think possibly rotating menus or something like that. She needs to get out in the community more and set up booths at things. Every other Saturday Block 34 market is a thing, that is going to help because people will be more likely to go from there when they are walking their dogs. She could reach out to the humane society and try to get some outreach there. She could reach out to stone cloud and empire if she can have prepackaged things to sell there. Have a treat of the week to donate a % of revenue to humane society. Look into events going on in Stillwater (temporary booths could make you a lot of money) </w:t>
+        <w:t xml:space="preserve"> think possibly rotating menus or something like that. </w:t>
+      </w:r>
+    </w:p>
+    <w:p>
+      <w:pPr>
+        <w:spacing w:before="80"/>
+      </w:pPr>
+    </w:p>
+    <w:p>
+      <w:pPr>
+        <w:spacing w:before="80"/>
+      </w:pPr>
+      <w:r>
+        <w:t>N</w:t>
+      </w:r>
+      <w:r>
+        <w:t xml:space="preserve">eeds to get out in the community more and set up booths at things. </w:t>
+      </w:r>
+    </w:p>
+    <w:p>
+      <w:pPr>
+        <w:spacing w:before="80"/>
+      </w:pPr>
+    </w:p>
+    <w:p>
+      <w:pPr>
+        <w:spacing w:before="80"/>
+      </w:pPr>
+      <w:r>
+        <w:t xml:space="preserve">Every other Saturday Block 34 market is a thing, that is going to help because people will be more likely to go from there when they are walking their </w:t>
+      </w:r>
+      <w:proofErr w:type="gramStart"/>
+      <w:r>
+        <w:t>dogs.</w:t>
+      </w:r>
+      <w:r>
+        <w:t>-</w:t>
+      </w:r>
+      <w:proofErr w:type="gramEnd"/>
+      <w:r>
+        <w:t xml:space="preserve"> Wait on that</w:t>
+      </w:r>
+    </w:p>
+    <w:p>
+      <w:pPr>
+        <w:spacing w:before="80"/>
+      </w:pPr>
+    </w:p>
+    <w:p>
+      <w:pPr>
+        <w:spacing w:before="80"/>
+      </w:pPr>
+      <w:r>
+        <w:t xml:space="preserve">She could reach out to the humane society and try to get some outreach there. </w:t>
+      </w:r>
+      <w:r>
+        <w:br/>
+      </w:r>
+      <w:r>
+        <w:br/>
+      </w:r>
+      <w:r>
+        <w:t xml:space="preserve">She could reach out to stone cloud and empire if she can have prepackaged things to sell there. </w:t>
+      </w:r>
+    </w:p>
+    <w:p>
+      <w:pPr>
+        <w:spacing w:before="80"/>
+      </w:pPr>
+    </w:p>
+    <w:p>
+      <w:pPr>
+        <w:spacing w:before="80"/>
+      </w:pPr>
+      <w:r>
+        <w:t xml:space="preserve">Have a treat of the week to donate a </w:t>
+      </w:r>
+      <w:r>
+        <w:t>10</w:t>
+      </w:r>
+      <w:r>
+        <w:t xml:space="preserve">% of revenue to humane society. Look into events going on in Stillwater (temporary booths could make you a lot of money) </w:t>
+      </w:r>
+    </w:p>
+    <w:p>
+      <w:pPr>
+        <w:spacing w:before="80"/>
+      </w:pPr>
+    </w:p>
+    <w:p>
+      <w:pPr>
+        <w:spacing w:before="80"/>
+      </w:pPr>
+      <w:r>
+        <w:t>Monthly treat box that people could subscribe too at a discounted price</w:t>
+      </w:r>
+    </w:p>
+    <w:p>
+      <w:pPr>
+        <w:spacing w:before="80"/>
+      </w:pPr>
+    </w:p>
+    <w:p>
+      <w:pPr>
+        <w:spacing w:before="80"/>
+        <w:rPr>
+          <w:b/>
+          <w:bCs/>
+          <w:sz w:val="24"/>
+          <w:szCs w:val="24"/>
+        </w:rPr>
+      </w:pPr>
+      <w:r>
+        <w:rPr>
+          <w:b/>
+          <w:bCs/>
+          <w:sz w:val="24"/>
+          <w:szCs w:val="24"/>
+          <w:highlight w:val="yellow"/>
+        </w:rPr>
+        <w:t>Follow up email:</w:t>
+      </w:r>
+    </w:p>
+    <w:p>
+      <w:pPr>
+        <w:spacing w:before="80"/>
+        <w:rPr>
+          <w:b/>
+          <w:bCs/>
+          <w:sz w:val="28"/>
+          <w:szCs w:val="28"/>
+        </w:rPr>
+      </w:pPr>
+      <w:r>
+        <w:rPr>
+          <w:b/>
+          <w:bCs/>
+          <w:sz w:val="28"/>
+          <w:szCs w:val="28"/>
+        </w:rPr>
+        <w:t xml:space="preserve">Website- wouldn’t mind going live with </w:t>
+      </w:r>
+      <w:proofErr w:type="spellStart"/>
+      <w:r>
+        <w:rPr>
+          <w:b/>
+          <w:bCs/>
+          <w:sz w:val="28"/>
+          <w:szCs w:val="28"/>
+        </w:rPr>
+        <w:t>venmo</w:t>
+      </w:r>
+      <w:proofErr w:type="spellEnd"/>
+      <w:r>
+        <w:rPr>
+          <w:b/>
+          <w:bCs/>
+          <w:sz w:val="28"/>
+          <w:szCs w:val="28"/>
+        </w:rPr>
+        <w:t xml:space="preserve"> for Cakes Only</w:t>
+      </w:r>
+    </w:p>
+    <w:p>
+      <w:pPr>
+        <w:spacing w:before="80"/>
+        <w:rPr>
+          <w:b/>
+          <w:bCs/>
+          <w:sz w:val="28"/>
+          <w:szCs w:val="28"/>
+        </w:rPr>
+      </w:pPr>
+      <w:r>
+        <w:rPr>
+          <w:b/>
+          <w:bCs/>
+          <w:sz w:val="28"/>
+          <w:szCs w:val="28"/>
+        </w:rPr>
+        <w:t>When they order cakes, need cake information and pictures drop down of what they want for the cake and when they want it, at least 2 hours between order and pickup</w:t>
+      </w:r>
+    </w:p>
+    <w:p>
+      <w:pPr>
+        <w:spacing w:before="80"/>
+      </w:pPr>
+      <w:r>
+        <w:t xml:space="preserve">Make footer and Nav bar Dark green </w:t>
+      </w:r>
+      <w:proofErr w:type="gramStart"/>
+      <w:r>
+        <w:t>similar to</w:t>
+      </w:r>
+      <w:proofErr w:type="gramEnd"/>
+      <w:r>
+        <w:t xml:space="preserve"> the store </w:t>
+      </w:r>
+      <w:proofErr w:type="spellStart"/>
+      <w:r>
+        <w:t>darkgrey</w:t>
+      </w:r>
+      <w:proofErr w:type="spellEnd"/>
+      <w:r>
+        <w:t xml:space="preserve"> green</w:t>
+      </w:r>
+    </w:p>
+    <w:p>
+      <w:pPr>
+        <w:spacing w:before="80"/>
+      </w:pPr>
+      <w:r>
+        <w:t xml:space="preserve">Square payment in the site (could be </w:t>
+      </w:r>
+      <w:proofErr w:type="gramStart"/>
+      <w:r>
+        <w:t>later on</w:t>
+      </w:r>
+      <w:proofErr w:type="gramEnd"/>
+      <w:r>
+        <w:t>)</w:t>
+      </w:r>
+    </w:p>
+    <w:p>
+      <w:pPr>
+        <w:spacing w:before="80"/>
+      </w:pPr>
+    </w:p>
+    <w:p>
+      <w:pPr>
+        <w:spacing w:before="80"/>
+      </w:pPr>
+      <w:r>
+        <w:lastRenderedPageBreak/>
+        <w:t>Wait on the payment for the site (just build out a static site for now- deploy the site this week)</w:t>
       </w:r>
     </w:p>
     <w:sectPr>

</xml_diff>